<commit_message>
docs: add visual architecture and UI UX professor PDFs
</commit_message>
<xml_diff>
--- a/docs/professor/00-Sunum-Rehberi.docx
+++ b/docs/professor/00-Sunum-Rehberi.docx
@@ -743,6 +743,95 @@
     </w:p>
     <w:p>
       <w:pPr>
+        <w:pStyle w:val="Heading2"/>
+      </w:pPr>
+      <w:r>
+        <w:t>Ek · Mimari ve UI/UX</w:t>
+      </w:r>
+    </w:p>
+    <w:p>
+      <w:r>
+        <w:rPr>
+          <w:rFonts w:ascii="Arial" w:hAnsi="Arial"/>
+          <w:color w:val="121212"/>
+          <w:sz w:val="20"/>
+        </w:rPr>
+        <w:t>Sorular mimari veya tasarıma gelirse:</w:t>
+      </w:r>
+    </w:p>
+    <w:p>
+      <w:pPr>
+        <w:pStyle w:val="ListBullet"/>
+        <w:spacing w:after="40"/>
+      </w:pPr>
+      <w:r>
+        <w:rPr>
+          <w:rFonts w:ascii="Arial" w:hAnsi="Arial"/>
+          <w:color w:val="55575C"/>
+          <w:sz w:val="18"/>
+        </w:rPr>
+        <w:t>05-Architecture.pdf</w:t>
+      </w:r>
+      <w:r>
+        <w:rPr>
+          <w:rFonts w:ascii="Arial" w:hAnsi="Arial"/>
+          <w:color w:val="121212"/>
+          <w:sz w:val="20"/>
+        </w:rPr>
+        <w:t>: sistem bağlamı, AI akışı, veri modeli, deploy ve güvenlik.</w:t>
+      </w:r>
+    </w:p>
+    <w:p>
+      <w:pPr>
+        <w:pStyle w:val="ListBullet"/>
+        <w:spacing w:after="40"/>
+      </w:pPr>
+      <w:r>
+        <w:rPr>
+          <w:rFonts w:ascii="Arial" w:hAnsi="Arial"/>
+          <w:color w:val="55575C"/>
+          <w:sz w:val="18"/>
+        </w:rPr>
+        <w:t>06-UI-UX.pdf</w:t>
+      </w:r>
+      <w:r>
+        <w:rPr>
+          <w:rFonts w:ascii="Arial" w:hAnsi="Arial"/>
+          <w:color w:val="121212"/>
+          <w:sz w:val="20"/>
+        </w:rPr>
+        <w:t>: gerçek mobil ekranlar, V2 tokenları, interaction ve audit.</w:t>
+      </w:r>
+    </w:p>
+    <w:p>
+      <w:r>
+        <w:rPr>
+          <w:rFonts w:ascii="Arial" w:hAnsi="Arial"/>
+          <w:color w:val="121212"/>
+          <w:sz w:val="20"/>
+        </w:rPr>
+        <w:t xml:space="preserve">Bu iki dosya, ana 10 dakikalık akışın yerine değil, </w:t>
+      </w:r>
+      <w:r>
+        <w:rPr>
+          <w:rFonts w:ascii="Arial" w:hAnsi="Arial"/>
+          <w:b/>
+          <w:color w:val="121212"/>
+          <w:sz w:val="20"/>
+        </w:rPr>
+        <w:t>derinleşme</w:t>
+      </w:r>
+      <w:r>
+        <w:rPr>
+          <w:rFonts w:ascii="Arial" w:hAnsi="Arial"/>
+          <w:color w:val="121212"/>
+          <w:sz w:val="20"/>
+        </w:rPr>
+        <w:t xml:space="preserve"> için kullanılmalıdır.</w:t>
+      </w:r>
+    </w:p>
+    <w:p>
+      <w:pPr>
         <w:pStyle w:val="Heading1"/>
       </w:pPr>
       <w:r>
@@ -989,6 +1078,98 @@
                 <w:sz w:val="16"/>
               </w:rPr>
               <w:t>Week 1–5 izlenebilirliği ve dürüst boşluklar</w:t>
+            </w:r>
+          </w:p>
+        </w:tc>
+      </w:tr>
+      <w:tr>
+        <w:tc>
+          <w:tcPr>
+            <w:tcW w:type="dxa" w:w="4986"/>
+            <w:tcMar>
+              <w:top w:w="70" w:type="dxa"/>
+              <w:start w:w="90" w:type="dxa"/>
+              <w:bottom w:w="70" w:type="dxa"/>
+              <w:end w:w="90" w:type="dxa"/>
+            </w:tcMar>
+          </w:tcPr>
+          <w:p>
+            <w:r/>
+            <w:r>
+              <w:rPr>
+                <w:rFonts w:ascii="Arial" w:hAnsi="Arial"/>
+                <w:color w:val="55575C"/>
+                <w:sz w:val="17"/>
+              </w:rPr>
+              <w:t>05-Architecture.pdf</w:t>
+            </w:r>
+          </w:p>
+        </w:tc>
+        <w:tc>
+          <w:tcPr>
+            <w:tcW w:type="dxa" w:w="4986"/>
+            <w:tcMar>
+              <w:top w:w="70" w:type="dxa"/>
+              <w:start w:w="90" w:type="dxa"/>
+              <w:bottom w:w="70" w:type="dxa"/>
+              <w:end w:w="90" w:type="dxa"/>
+            </w:tcMar>
+          </w:tcPr>
+          <w:p>
+            <w:r/>
+            <w:r>
+              <w:rPr>
+                <w:rFonts w:ascii="Arial" w:hAnsi="Arial"/>
+                <w:color w:val="121212"/>
+                <w:sz w:val="16"/>
+              </w:rPr>
+              <w:t>Sistem bağlamı, AI akışı, veri modeli ve deploy</w:t>
+            </w:r>
+          </w:p>
+        </w:tc>
+      </w:tr>
+      <w:tr>
+        <w:tc>
+          <w:tcPr>
+            <w:tcW w:type="dxa" w:w="4986"/>
+            <w:tcMar>
+              <w:top w:w="70" w:type="dxa"/>
+              <w:start w:w="90" w:type="dxa"/>
+              <w:bottom w:w="70" w:type="dxa"/>
+              <w:end w:w="90" w:type="dxa"/>
+            </w:tcMar>
+          </w:tcPr>
+          <w:p>
+            <w:r/>
+            <w:r>
+              <w:rPr>
+                <w:rFonts w:ascii="Arial" w:hAnsi="Arial"/>
+                <w:color w:val="55575C"/>
+                <w:sz w:val="17"/>
+              </w:rPr>
+              <w:t>06-UI-UX.pdf</w:t>
+            </w:r>
+          </w:p>
+        </w:tc>
+        <w:tc>
+          <w:tcPr>
+            <w:tcW w:type="dxa" w:w="4986"/>
+            <w:tcMar>
+              <w:top w:w="70" w:type="dxa"/>
+              <w:start w:w="90" w:type="dxa"/>
+              <w:bottom w:w="70" w:type="dxa"/>
+              <w:end w:w="90" w:type="dxa"/>
+            </w:tcMar>
+          </w:tcPr>
+          <w:p>
+            <w:r/>
+            <w:r>
+              <w:rPr>
+                <w:rFonts w:ascii="Arial" w:hAnsi="Arial"/>
+                <w:color w:val="121212"/>
+                <w:sz w:val="16"/>
+              </w:rPr>
+              <w:t>V2 tasarım dili, gerçek ekranlar ve interaction kararları</w:t>
             </w:r>
           </w:p>
         </w:tc>

</xml_diff>